<commit_message>
Rewrite summaries as narrative arcs; reframe Sidekick signals as external/internal
Summaries now read as cause-and-effect stories (promoted -> inherited
a problem -> actions taken -> result -> forward-looking ask) instead
of disconnected fact sentences. Sidekick's data sources reframed as
external signals (board minutes, CIPs) and internal signals (prior
product usage, engagement history) in both bullets and summaries.

Co-Authored-By: Claude Fable 5 <noreply@anthropic.com>
Claude-Session: https://claude.ai/code/session_01Kq1GVuDP62P4fjx7tfK9jZ
</commit_message>
<xml_diff>
--- a/outreach/resumes/Aritra_Pramanik_Account-Executive_Resume.docx
+++ b/outreach/resumes/Aritra_Pramanik_Account-Executive_Resume.docx
@@ -52,7 +52,7 @@
         </w:rPr>
         <w:t xml:space="preserve">Bengaluru, Karnataka, India  |  9903132717  |  aritropramanik@gmail.com  |  </w:t>
       </w:r>
-      <w:hyperlink w:history="1" r:id="rId658kv16pevwufxmwku6qd">
+      <w:hyperlink w:history="1" r:id="rIdpugq7ig1t-olywsrwiu5w">
         <w:r>
           <w:rPr>
             <w:rFonts w:ascii="Calibri" w:cs="Calibri" w:eastAsia="Calibri" w:hAnsi="Calibri"/>
@@ -73,7 +73,7 @@
         </w:rPr>
         <w:t xml:space="preserve">  |  </w:t>
       </w:r>
-      <w:hyperlink w:history="1" r:id="rId1kniy3gpnvdl-cjw4mwdt">
+      <w:hyperlink w:history="1" r:id="rId6ludx97agovazuyx0uu07">
         <w:r>
           <w:rPr>
             <w:rFonts w:ascii="Calibri" w:cs="Calibri" w:eastAsia="Calibri" w:hAnsi="Calibri"/>
@@ -119,7 +119,7 @@
           <w:sz w:val="21"/>
           <w:szCs w:val="21"/>
         </w:rPr>
-        <w:t xml:space="preserve">BDR generating outbound pipeline for B2B SaaS — $500K qualified enterprise pipeline at Branch, 200% peak individual quota at Wayground (formerly Quizizz), now leading a 15-rep team at 110% attainment. Full-cycle, consultative sales background before moving into SaaS outbound. Known for signal-driven selling: built an AI copilot that mines prospects' board minutes and improvement plans so every conversation opens on the buyer's stated priority, not a template.</w:t>
+        <w:t xml:space="preserve">Started in full-cycle, consultative sales before moving into B2B SaaS outbound to build the other half of the deal — pipeline generation and discovery. That combination shows in the numbers: $500K in qualified enterprise pipeline at Branch, 200% peak individual quota at Wayground (formerly Quizizz), and a promotion to BDR Team Lead now running a 15-rep team at 110% attainment. Also built BDR Sidekick, an AI copilot that combines external signals (board minutes) and internal signals (prior product usage) so every call opens on the buyer's stated priority — the same discovery instinct that closes deals. Ready to bring prospecting and closing back into one seat.</w:t>
       </w:r>
     </w:p>
     <w:p>
@@ -307,9 +307,9 @@
           <w:sz w:val="20"/>
           <w:szCs w:val="20"/>
         </w:rPr>
-        <w:t xml:space="preserve"> that mines board meeting minutes and improvement plans across 10,400+ prospect accounts into a per-account opening question and discovery path — the same signal-driven approach that shapes every conversation before the first word is said. Live demo: </w:t>
-      </w:r>
-      <w:hyperlink w:history="1" r:id="rIdhzpp9ajfnu5qzbdnw2ta3">
+        <w:t xml:space="preserve"> that combines external signals (board minutes, improvement plans) and internal signals (prior product usage, engagement history) across 10,400+ prospect accounts into a per-account opening question and discovery path — the same signal-driven approach that shapes every conversation before the first word is said. Live demo: </w:t>
+      </w:r>
+      <w:hyperlink w:history="1" r:id="rIdlwzqvkaxxndieclj3gyv3">
         <w:r>
           <w:rPr>
             <w:rFonts w:ascii="Calibri" w:cs="Calibri" w:eastAsia="Calibri" w:hAnsi="Calibri"/>

</xml_diff>